<commit_message>
Supplementary Note S3 update: §S3.6 now reproduces locked v0.2.5 feature-importance numbers verbatim from rf_feature_importance.csv (no longer forward-reference); §S3.7 includes inline F1-F4 verdict/margin table from rf_falsifiability_checks.csv; §S3.8 OSF trail updated to list both new artefacts as Stage 02 outputs
</commit_message>
<xml_diff>
--- a/manuscript/supplement/S3_Backscatter_Signatures_Note.docx
+++ b/manuscript/supplement/S3_Backscatter_Signatures_Note.docx
@@ -2027,7 +2027,7 @@
           <w:rFonts w:ascii="Arial" w:hAnsi="Arial"/>
           <w:sz w:val="20"/>
         </w:rPr>
-        <w:t xml:space="preserve">at run time. Numbers above are the locked v0.2.5 baseline.) The top three features are all derived from Sentinel-1, consistent with the design assumption that radar — not optical — carries the discriminating information for inundation under cloud and at sub-daily latency. The ERA5 wind feature carries the cyclonic-event filter; without it, mechanism (A) (transplanting) and mechanism (B) (surge) become harder to separate at the very low ΔVH end.</w:t>
+        <w:t xml:space="preserve">and reproduced here verbatim. Numbers above are the locked v0.2.5 baseline.) Sentinel-1-derived features (ranks 1, 2, 3, plus ΔCR which is also S1-derived) carry 0.66 of total importance — consistent with the design assumption that radar, not optical, carries the discriminating information for inundation under cloud and at sub-daily latency. The ERA5 wind feature carries the cyclonic-event filter; without it, mechanism (A) (transplanting) and mechanism (B) (surge) become harder to separate at the very low ΔVH end.</w:t>
       </w:r>
     </w:p>
     <w:p>
@@ -2233,7 +2233,448 @@
           <w:rFonts w:ascii="Arial" w:hAnsi="Arial"/>
           <w:sz w:val="20"/>
         </w:rPr>
-        <w:t xml:space="preserve">checked empirically by Module 02 on the labelled training set. The locked v0.2.5 baseline passes all four. The numbers and pass/fail margins are written to</w:t>
+        <w:t xml:space="preserve">checked empirically by Module 02 on the labelled training set. The locked v0.2.5 baseline passes all four with the following observed margins:</w:t>
+      </w:r>
+    </w:p>
+    <w:tbl>
+      <w:tblPr>
+        <w:tblStyle w:val="Table"/>
+        <w:tblW w:type="pct" w:w="5000"/>
+        <w:jc w:val="left"/>
+        <w:tblLayout w:type="fixed"/>
+        <w:tblLook w:firstRow="1" w:lastRow="0" w:firstColumn="0" w:lastColumn="0" w:noHBand="0" w:noVBand="0" w:val="0020"/>
+      </w:tblPr>
+      <w:tblGrid>
+        <w:gridCol w:w="1232"/>
+        <w:gridCol w:w="1936"/>
+        <w:gridCol w:w="1760"/>
+        <w:gridCol w:w="1408"/>
+        <w:gridCol w:w="1584"/>
+      </w:tblGrid>
+      <w:tr>
+        <w:trPr>
+          <w:tblHeader w:val="on"/>
+        </w:trPr>
+        <w:tc>
+          <w:tcPr/>
+          <w:p>
+            <w:pPr>
+              <w:pStyle w:val="Compact"/>
+              <w:jc w:val="left"/>
+            </w:pPr>
+            <w:r>
+              <w:rPr>
+                <w:rFonts w:ascii="Arial" w:hAnsi="Arial"/>
+                <w:sz w:val="18"/>
+              </w:rPr>
+              <w:t xml:space="preserve">Check</w:t>
+            </w:r>
+          </w:p>
+        </w:tc>
+        <w:tc>
+          <w:tcPr/>
+          <w:p>
+            <w:pPr>
+              <w:pStyle w:val="Compact"/>
+              <w:jc w:val="left"/>
+            </w:pPr>
+            <w:r>
+              <w:rPr>
+                <w:rFonts w:ascii="Arial" w:hAnsi="Arial"/>
+                <w:sz w:val="18"/>
+              </w:rPr>
+              <w:t xml:space="preserve">Threshold</w:t>
+            </w:r>
+          </w:p>
+        </w:tc>
+        <w:tc>
+          <w:tcPr/>
+          <w:p>
+            <w:pPr>
+              <w:pStyle w:val="Compact"/>
+              <w:jc w:val="left"/>
+            </w:pPr>
+            <w:r>
+              <w:rPr>
+                <w:rFonts w:ascii="Arial" w:hAnsi="Arial"/>
+                <w:sz w:val="18"/>
+              </w:rPr>
+              <w:t xml:space="preserve">Observed</w:t>
+            </w:r>
+          </w:p>
+        </w:tc>
+        <w:tc>
+          <w:tcPr/>
+          <w:p>
+            <w:pPr>
+              <w:pStyle w:val="Compact"/>
+              <w:jc w:val="left"/>
+            </w:pPr>
+            <w:r>
+              <w:rPr>
+                <w:rFonts w:ascii="Arial" w:hAnsi="Arial"/>
+                <w:sz w:val="18"/>
+              </w:rPr>
+              <w:t xml:space="preserve">Margin</w:t>
+            </w:r>
+          </w:p>
+        </w:tc>
+        <w:tc>
+          <w:tcPr/>
+          <w:p>
+            <w:pPr>
+              <w:pStyle w:val="Compact"/>
+              <w:jc w:val="left"/>
+            </w:pPr>
+            <w:r>
+              <w:rPr>
+                <w:rFonts w:ascii="Arial" w:hAnsi="Arial"/>
+                <w:sz w:val="18"/>
+              </w:rPr>
+              <w:t xml:space="preserve">Verdict</w:t>
+            </w:r>
+          </w:p>
+        </w:tc>
+      </w:tr>
+      <w:tr>
+        <w:tc>
+          <w:tcPr/>
+          <w:p>
+            <w:pPr>
+              <w:pStyle w:val="Compact"/>
+              <w:jc w:val="left"/>
+            </w:pPr>
+            <w:r>
+              <w:rPr>
+                <w:rFonts w:ascii="Arial" w:hAnsi="Arial"/>
+                <w:sz w:val="18"/>
+              </w:rPr>
+              <w:t xml:space="preserve">F1 — ΔVH gap (surge − transplanting)</w:t>
+            </w:r>
+          </w:p>
+        </w:tc>
+        <w:tc>
+          <w:tcPr/>
+          <w:p>
+            <w:pPr>
+              <w:pStyle w:val="Compact"/>
+              <w:jc w:val="left"/>
+            </w:pPr>
+            <w:r>
+              <w:rPr>
+                <w:rFonts w:ascii="Arial" w:hAnsi="Arial"/>
+                <w:sz w:val="18"/>
+              </w:rPr>
+              <w:t xml:space="preserve">≥ 3.0 dB</w:t>
+            </w:r>
+          </w:p>
+        </w:tc>
+        <w:tc>
+          <w:tcPr/>
+          <w:p>
+            <w:pPr>
+              <w:pStyle w:val="Compact"/>
+              <w:jc w:val="left"/>
+            </w:pPr>
+            <w:r>
+              <w:rPr>
+                <w:rFonts w:ascii="Arial" w:hAnsi="Arial"/>
+                <w:sz w:val="18"/>
+              </w:rPr>
+              <w:t xml:space="preserve">4.0 dB</w:t>
+            </w:r>
+          </w:p>
+        </w:tc>
+        <w:tc>
+          <w:tcPr/>
+          <w:p>
+            <w:pPr>
+              <w:pStyle w:val="Compact"/>
+              <w:jc w:val="left"/>
+            </w:pPr>
+            <w:r>
+              <w:rPr>
+                <w:rFonts w:ascii="Arial" w:hAnsi="Arial"/>
+                <w:sz w:val="18"/>
+              </w:rPr>
+              <w:t xml:space="preserve">+1.0 dB</w:t>
+            </w:r>
+          </w:p>
+        </w:tc>
+        <w:tc>
+          <w:tcPr/>
+          <w:p>
+            <w:pPr>
+              <w:pStyle w:val="Compact"/>
+              <w:jc w:val="left"/>
+            </w:pPr>
+            <w:r>
+              <w:rPr>
+                <w:rFonts w:ascii="Arial" w:hAnsi="Arial"/>
+                <w:sz w:val="18"/>
+              </w:rPr>
+              <w:t xml:space="preserve">pass</w:t>
+            </w:r>
+          </w:p>
+        </w:tc>
+      </w:tr>
+      <w:tr>
+        <w:tc>
+          <w:tcPr/>
+          <w:p>
+            <w:pPr>
+              <w:pStyle w:val="Compact"/>
+              <w:jc w:val="left"/>
+            </w:pPr>
+            <w:r>
+              <w:rPr>
+                <w:rFonts w:ascii="Arial" w:hAnsi="Arial"/>
+                <w:sz w:val="18"/>
+              </w:rPr>
+              <w:t xml:space="preserve">F2 — onset-rate separation</w:t>
+            </w:r>
+          </w:p>
+        </w:tc>
+        <w:tc>
+          <w:tcPr/>
+          <w:p>
+            <w:pPr>
+              <w:pStyle w:val="Compact"/>
+              <w:jc w:val="left"/>
+            </w:pPr>
+            <w:r>
+              <w:rPr>
+                <w:rFonts w:ascii="Arial" w:hAnsi="Arial"/>
+                <w:sz w:val="18"/>
+              </w:rPr>
+              <w:t xml:space="preserve">≥ 4×</w:t>
+            </w:r>
+          </w:p>
+        </w:tc>
+        <w:tc>
+          <w:tcPr/>
+          <w:p>
+            <w:pPr>
+              <w:pStyle w:val="Compact"/>
+              <w:jc w:val="left"/>
+            </w:pPr>
+            <w:r>
+              <w:rPr>
+                <w:rFonts w:ascii="Arial" w:hAnsi="Arial"/>
+                <w:sz w:val="18"/>
+              </w:rPr>
+              <w:t xml:space="preserve">12×</w:t>
+            </w:r>
+          </w:p>
+        </w:tc>
+        <w:tc>
+          <w:tcPr/>
+          <w:p>
+            <w:pPr>
+              <w:pStyle w:val="Compact"/>
+              <w:jc w:val="left"/>
+            </w:pPr>
+            <w:r>
+              <w:rPr>
+                <w:rFonts w:ascii="Arial" w:hAnsi="Arial"/>
+                <w:sz w:val="18"/>
+              </w:rPr>
+              <w:t xml:space="preserve">+8×</w:t>
+            </w:r>
+          </w:p>
+        </w:tc>
+        <w:tc>
+          <w:tcPr/>
+          <w:p>
+            <w:pPr>
+              <w:pStyle w:val="Compact"/>
+              <w:jc w:val="left"/>
+            </w:pPr>
+            <w:r>
+              <w:rPr>
+                <w:rFonts w:ascii="Arial" w:hAnsi="Arial"/>
+                <w:sz w:val="18"/>
+              </w:rPr>
+              <w:t xml:space="preserve">pass</w:t>
+            </w:r>
+          </w:p>
+        </w:tc>
+      </w:tr>
+      <w:tr>
+        <w:tc>
+          <w:tcPr/>
+          <w:p>
+            <w:pPr>
+              <w:pStyle w:val="Compact"/>
+              <w:jc w:val="left"/>
+            </w:pPr>
+            <w:r>
+              <w:rPr>
+                <w:rFonts w:ascii="Arial" w:hAnsi="Arial"/>
+                <w:sz w:val="18"/>
+              </w:rPr>
+              <w:t xml:space="preserve">F3 — wind ⊥ transplanting onset</w:t>
+            </w:r>
+          </w:p>
+        </w:tc>
+        <w:tc>
+          <w:tcPr/>
+          <w:p>
+            <w:pPr>
+              <w:pStyle w:val="Compact"/>
+              <w:jc w:val="left"/>
+            </w:pPr>
+            <w:r>
+              <w:rPr>
+                <w:rFonts w:ascii="Arial" w:hAnsi="Arial"/>
+                <w:sz w:val="18"/>
+              </w:rPr>
+              <w:t xml:space="preserve">|r| ≤ 0.30</w:t>
+            </w:r>
+          </w:p>
+        </w:tc>
+        <w:tc>
+          <w:tcPr/>
+          <w:p>
+            <w:pPr>
+              <w:pStyle w:val="Compact"/>
+              <w:jc w:val="left"/>
+            </w:pPr>
+            <w:r>
+              <w:rPr>
+                <w:rFonts w:ascii="Arial" w:hAnsi="Arial"/>
+                <w:sz w:val="18"/>
+              </w:rPr>
+              <w:t xml:space="preserve">r = 0.08</w:t>
+            </w:r>
+          </w:p>
+        </w:tc>
+        <w:tc>
+          <w:tcPr/>
+          <w:p>
+            <w:pPr>
+              <w:pStyle w:val="Compact"/>
+              <w:jc w:val="left"/>
+            </w:pPr>
+            <w:r>
+              <w:rPr>
+                <w:rFonts w:ascii="Arial" w:hAnsi="Arial"/>
+                <w:sz w:val="18"/>
+              </w:rPr>
+              <w:t xml:space="preserve">+0.22</w:t>
+            </w:r>
+          </w:p>
+        </w:tc>
+        <w:tc>
+          <w:tcPr/>
+          <w:p>
+            <w:pPr>
+              <w:pStyle w:val="Compact"/>
+              <w:jc w:val="left"/>
+            </w:pPr>
+            <w:r>
+              <w:rPr>
+                <w:rFonts w:ascii="Arial" w:hAnsi="Arial"/>
+                <w:sz w:val="18"/>
+              </w:rPr>
+              <w:t xml:space="preserve">pass</w:t>
+            </w:r>
+          </w:p>
+        </w:tc>
+      </w:tr>
+      <w:tr>
+        <w:tc>
+          <w:tcPr/>
+          <w:p>
+            <w:pPr>
+              <w:pStyle w:val="Compact"/>
+              <w:jc w:val="left"/>
+            </w:pPr>
+            <w:r>
+              <w:rPr>
+                <w:rFonts w:ascii="Arial" w:hAnsi="Arial"/>
+                <w:sz w:val="18"/>
+              </w:rPr>
+              <w:t xml:space="preserve">F4 — persistent post-event VH deficit</w:t>
+            </w:r>
+          </w:p>
+        </w:tc>
+        <w:tc>
+          <w:tcPr/>
+          <w:p>
+            <w:pPr>
+              <w:pStyle w:val="Compact"/>
+              <w:jc w:val="left"/>
+            </w:pPr>
+            <w:r>
+              <w:rPr>
+                <w:rFonts w:ascii="Arial" w:hAnsi="Arial"/>
+                <w:sz w:val="18"/>
+              </w:rPr>
+              <w:t xml:space="preserve">≥ 1.0 dB at +30 d</w:t>
+            </w:r>
+          </w:p>
+        </w:tc>
+        <w:tc>
+          <w:tcPr/>
+          <w:p>
+            <w:pPr>
+              <w:pStyle w:val="Compact"/>
+              <w:jc w:val="left"/>
+            </w:pPr>
+            <w:r>
+              <w:rPr>
+                <w:rFonts w:ascii="Arial" w:hAnsi="Arial"/>
+                <w:sz w:val="18"/>
+              </w:rPr>
+              <w:t xml:space="preserve">1.8 dB</w:t>
+            </w:r>
+          </w:p>
+        </w:tc>
+        <w:tc>
+          <w:tcPr/>
+          <w:p>
+            <w:pPr>
+              <w:pStyle w:val="Compact"/>
+              <w:jc w:val="left"/>
+            </w:pPr>
+            <w:r>
+              <w:rPr>
+                <w:rFonts w:ascii="Arial" w:hAnsi="Arial"/>
+                <w:sz w:val="18"/>
+              </w:rPr>
+              <w:t xml:space="preserve">+0.8 dB</w:t>
+            </w:r>
+          </w:p>
+        </w:tc>
+        <w:tc>
+          <w:tcPr/>
+          <w:p>
+            <w:pPr>
+              <w:pStyle w:val="Compact"/>
+              <w:jc w:val="left"/>
+            </w:pPr>
+            <w:r>
+              <w:rPr>
+                <w:rFonts w:ascii="Arial" w:hAnsi="Arial"/>
+                <w:sz w:val="18"/>
+              </w:rPr>
+              <w:t xml:space="preserve">pass</w:t>
+            </w:r>
+          </w:p>
+        </w:tc>
+      </w:tr>
+    </w:tbl>
+    <w:p>
+      <w:pPr>
+        <w:pStyle w:val="BodyText"/>
+      </w:pPr>
+      <w:r>
+        <w:rPr>
+          <w:rFonts w:ascii="Arial" w:hAnsi="Arial"/>
+          <w:sz w:val="20"/>
+        </w:rPr>
+        <w:t xml:space="preserve">The numbers and pass/fail margins are written to</w:t>
       </w:r>
       <w:r>
         <w:rPr>
@@ -2255,7 +2696,14 @@
           <w:rFonts w:ascii="Arial" w:hAnsi="Arial"/>
           <w:sz w:val="20"/>
         </w:rPr>
-        <w:t xml:space="preserve">.</w:t>
+        <w:t xml:space="preserve"> </w:t>
+      </w:r>
+      <w:r>
+        <w:rPr>
+          <w:rFonts w:ascii="Arial" w:hAnsi="Arial"/>
+          <w:sz w:val="20"/>
+        </w:rPr>
+        <w:t xml:space="preserve">(emitted by Module 02 on every harness run).</w:t>
       </w:r>
     </w:p>
     <w:p>
@@ -2676,7 +3124,44 @@
           <w:rFonts w:ascii="Arial" w:hAnsi="Arial"/>
           <w:sz w:val="20"/>
         </w:rPr>
-        <w:t xml:space="preserve">the Module 02 random-forest feature-importance CSV when retraining is run (Stage 02 of the harness).</w:t>
+        <w:t xml:space="preserve">the Module 02 random-forest feature-importance CSV and falsifiability-check CSV (</w:t>
+      </w:r>
+      <w:r>
+        <w:rPr>
+          <w:rStyle w:val="VerbatimChar"/>
+          <w:rFonts w:ascii="Arial" w:hAnsi="Arial"/>
+          <w:sz w:val="20"/>
+        </w:rPr>
+        <w:t xml:space="preserve">rf_feature_importance.csv</w:t>
+      </w:r>
+      <w:r>
+        <w:rPr>
+          <w:rFonts w:ascii="Arial" w:hAnsi="Arial"/>
+          <w:sz w:val="20"/>
+        </w:rPr>
+        <w:t xml:space="preserve">,</w:t>
+      </w:r>
+      <w:r>
+        <w:rPr>
+          <w:rFonts w:ascii="Arial" w:hAnsi="Arial"/>
+          <w:sz w:val="20"/>
+        </w:rPr>
+        <w:t xml:space="preserve"> </w:t>
+      </w:r>
+      <w:r>
+        <w:rPr>
+          <w:rStyle w:val="VerbatimChar"/>
+          <w:rFonts w:ascii="Arial" w:hAnsi="Arial"/>
+          <w:sz w:val="20"/>
+        </w:rPr>
+        <w:t xml:space="preserve">rf_falsifiability_checks.csv</w:t>
+      </w:r>
+      <w:r>
+        <w:rPr>
+          <w:rFonts w:ascii="Arial" w:hAnsi="Arial"/>
+          <w:sz w:val="20"/>
+        </w:rPr>
+        <w:t xml:space="preserve">), emitted on every harness run (Stage 02).</w:t>
       </w:r>
     </w:p>
     <w:p>

</xml_diff>